<commit_message>
update: new BA Verlap template
</commit_message>
<xml_diff>
--- a/src/templates/verifikasi-lapangan/template_ba_verlap.docx
+++ b/src/templates/verifikasi-lapangan/template_ba_verlap.docx
@@ -449,16 +449,12 @@
         <w:jc w:val="both"/>
         <w:rPr>
           <w:rFonts w:ascii="Arial" w:eastAsia="Arial Unicode MS" w:hAnsi="Arial" w:cs="Arial"/>
-          <w:sz w:val="24"/>
-          <w:szCs w:val="24"/>
           <w:lang w:eastAsia="id-ID"/>
         </w:rPr>
       </w:pPr>
       <w:r>
         <w:rPr>
           <w:rFonts w:ascii="Arial" w:eastAsia="Arial Unicode MS" w:hAnsi="Arial" w:cs="Arial"/>
-          <w:sz w:val="24"/>
-          <w:szCs w:val="24"/>
           <w:lang w:eastAsia="id-ID"/>
         </w:rPr>
         <w:t>Pada hari ini</w:t>
@@ -466,8 +462,6 @@
       <w:r>
         <w:rPr>
           <w:rFonts w:ascii="Arial" w:eastAsia="Arial Unicode MS" w:hAnsi="Arial" w:cs="Arial"/>
-          <w:sz w:val="24"/>
-          <w:szCs w:val="24"/>
           <w:lang w:val="en-US" w:eastAsia="id-ID"/>
         </w:rPr>
         <w:t>,</w:t>
@@ -475,8 +469,6 @@
       <w:r>
         <w:rPr>
           <w:rFonts w:ascii="Arial" w:eastAsia="Arial Unicode MS" w:hAnsi="Arial" w:cs="Arial"/>
-          <w:sz w:val="24"/>
-          <w:szCs w:val="24"/>
           <w:lang w:eastAsia="id-ID"/>
         </w:rPr>
         <w:t xml:space="preserve"> </w:t>
@@ -486,8 +478,6 @@
           <w:rFonts w:ascii="Arial" w:eastAsia="Arial Unicode MS" w:hAnsi="Arial" w:cs="Arial"/>
           <w:i/>
           <w:iCs/>
-          <w:sz w:val="24"/>
-          <w:szCs w:val="24"/>
           <w:lang w:eastAsia="id-ID"/>
         </w:rPr>
         <w:t>{</w:t>
@@ -498,8 +488,6 @@
           <w:rFonts w:ascii="Arial" w:eastAsia="Arial Unicode MS" w:hAnsi="Arial" w:cs="Arial"/>
           <w:i/>
           <w:iCs/>
-          <w:sz w:val="24"/>
-          <w:szCs w:val="24"/>
           <w:lang w:eastAsia="id-ID"/>
         </w:rPr>
         <w:t>hari_ini_nama</w:t>
@@ -510,8 +498,6 @@
           <w:rFonts w:ascii="Arial" w:eastAsia="Arial Unicode MS" w:hAnsi="Arial" w:cs="Arial"/>
           <w:i/>
           <w:iCs/>
-          <w:sz w:val="24"/>
-          <w:szCs w:val="24"/>
           <w:lang w:eastAsia="id-ID"/>
         </w:rPr>
         <w:t>}</w:t>
@@ -519,8 +505,6 @@
       <w:r>
         <w:rPr>
           <w:rFonts w:ascii="Arial" w:eastAsia="Arial Unicode MS" w:hAnsi="Arial" w:cs="Arial"/>
-          <w:sz w:val="24"/>
-          <w:szCs w:val="24"/>
           <w:lang w:eastAsia="id-ID"/>
         </w:rPr>
         <w:t xml:space="preserve">, </w:t>
@@ -528,8 +512,6 @@
       <w:r>
         <w:rPr>
           <w:rFonts w:ascii="Arial" w:eastAsia="Arial Unicode MS" w:hAnsi="Arial" w:cs="Arial"/>
-          <w:sz w:val="24"/>
-          <w:szCs w:val="24"/>
           <w:lang w:val="en-US" w:eastAsia="id-ID"/>
         </w:rPr>
         <w:t>T</w:t>
@@ -537,8 +519,6 @@
       <w:r>
         <w:rPr>
           <w:rFonts w:ascii="Arial" w:eastAsia="Arial Unicode MS" w:hAnsi="Arial" w:cs="Arial"/>
-          <w:sz w:val="24"/>
-          <w:szCs w:val="24"/>
           <w:lang w:eastAsia="id-ID"/>
         </w:rPr>
         <w:t xml:space="preserve">anggal </w:t>
@@ -546,8 +526,6 @@
       <w:r>
         <w:rPr>
           <w:rFonts w:ascii="Arial" w:eastAsia="Arial Unicode MS" w:hAnsi="Arial" w:cs="Arial"/>
-          <w:sz w:val="24"/>
-          <w:szCs w:val="24"/>
           <w:lang w:eastAsia="id-ID"/>
         </w:rPr>
         <w:t>{</w:t>
@@ -556,8 +534,6 @@
       <w:r>
         <w:rPr>
           <w:rFonts w:ascii="Arial" w:eastAsia="Arial Unicode MS" w:hAnsi="Arial" w:cs="Arial"/>
-          <w:sz w:val="24"/>
-          <w:szCs w:val="24"/>
           <w:lang w:eastAsia="id-ID"/>
         </w:rPr>
         <w:t>hari_ini_tanggal_terbilang</w:t>
@@ -566,8 +542,6 @@
       <w:r>
         <w:rPr>
           <w:rFonts w:ascii="Arial" w:eastAsia="Arial Unicode MS" w:hAnsi="Arial" w:cs="Arial"/>
-          <w:sz w:val="24"/>
-          <w:szCs w:val="24"/>
           <w:lang w:eastAsia="id-ID"/>
         </w:rPr>
         <w:t>}</w:t>
@@ -575,8 +549,6 @@
       <w:r>
         <w:rPr>
           <w:rFonts w:ascii="Arial" w:eastAsia="Arial Unicode MS" w:hAnsi="Arial" w:cs="Arial"/>
-          <w:sz w:val="24"/>
-          <w:szCs w:val="24"/>
           <w:lang w:val="en-US" w:eastAsia="id-ID"/>
         </w:rPr>
         <w:t xml:space="preserve"> B</w:t>
@@ -584,8 +556,6 @@
       <w:r>
         <w:rPr>
           <w:rFonts w:ascii="Arial" w:eastAsia="Arial Unicode MS" w:hAnsi="Arial" w:cs="Arial"/>
-          <w:sz w:val="24"/>
-          <w:szCs w:val="24"/>
           <w:lang w:eastAsia="id-ID"/>
         </w:rPr>
         <w:t xml:space="preserve">ulan </w:t>
@@ -593,8 +563,6 @@
       <w:r>
         <w:rPr>
           <w:rFonts w:ascii="Arial" w:eastAsia="Arial Unicode MS" w:hAnsi="Arial" w:cs="Arial"/>
-          <w:sz w:val="24"/>
-          <w:szCs w:val="24"/>
           <w:lang w:eastAsia="id-ID"/>
         </w:rPr>
         <w:t>{</w:t>
@@ -603,8 +571,6 @@
       <w:r>
         <w:rPr>
           <w:rFonts w:ascii="Arial" w:eastAsia="Arial Unicode MS" w:hAnsi="Arial" w:cs="Arial"/>
-          <w:sz w:val="24"/>
-          <w:szCs w:val="24"/>
           <w:lang w:eastAsia="id-ID"/>
         </w:rPr>
         <w:t>hari_ini_bulan</w:t>
@@ -613,8 +579,6 @@
       <w:r>
         <w:rPr>
           <w:rFonts w:ascii="Arial" w:eastAsia="Arial Unicode MS" w:hAnsi="Arial" w:cs="Arial"/>
-          <w:sz w:val="24"/>
-          <w:szCs w:val="24"/>
           <w:lang w:eastAsia="id-ID"/>
         </w:rPr>
         <w:t>}</w:t>
@@ -622,8 +586,6 @@
       <w:r>
         <w:rPr>
           <w:rFonts w:ascii="Arial" w:eastAsia="Arial Unicode MS" w:hAnsi="Arial" w:cs="Arial"/>
-          <w:sz w:val="24"/>
-          <w:szCs w:val="24"/>
           <w:lang w:val="en-US" w:eastAsia="id-ID"/>
         </w:rPr>
         <w:t>,</w:t>
@@ -631,8 +593,6 @@
       <w:r>
         <w:rPr>
           <w:rFonts w:ascii="Arial" w:eastAsia="Arial Unicode MS" w:hAnsi="Arial" w:cs="Arial"/>
-          <w:sz w:val="24"/>
-          <w:szCs w:val="24"/>
           <w:lang w:val="en-US" w:eastAsia="id-ID"/>
         </w:rPr>
         <w:t xml:space="preserve"> </w:t>
@@ -640,8 +600,6 @@
       <w:r>
         <w:rPr>
           <w:rFonts w:ascii="Arial" w:eastAsia="Arial Unicode MS" w:hAnsi="Arial" w:cs="Arial"/>
-          <w:sz w:val="24"/>
-          <w:szCs w:val="24"/>
           <w:lang w:val="en-US" w:eastAsia="id-ID"/>
         </w:rPr>
         <w:t>T</w:t>
@@ -650,8 +608,6 @@
       <w:r>
         <w:rPr>
           <w:rFonts w:ascii="Arial" w:eastAsia="Arial Unicode MS" w:hAnsi="Arial" w:cs="Arial"/>
-          <w:sz w:val="24"/>
-          <w:szCs w:val="24"/>
           <w:lang w:eastAsia="id-ID"/>
         </w:rPr>
         <w:t>ahun</w:t>
@@ -660,8 +616,6 @@
       <w:r>
         <w:rPr>
           <w:rFonts w:ascii="Arial" w:eastAsia="Arial Unicode MS" w:hAnsi="Arial" w:cs="Arial"/>
-          <w:sz w:val="24"/>
-          <w:szCs w:val="24"/>
           <w:lang w:eastAsia="id-ID"/>
         </w:rPr>
         <w:t xml:space="preserve"> </w:t>
@@ -669,8 +623,6 @@
       <w:r>
         <w:rPr>
           <w:rFonts w:ascii="Arial" w:eastAsia="Arial Unicode MS" w:hAnsi="Arial" w:cs="Arial"/>
-          <w:sz w:val="24"/>
-          <w:szCs w:val="24"/>
           <w:lang w:eastAsia="id-ID"/>
         </w:rPr>
         <w:t>{</w:t>
@@ -679,8 +631,6 @@
       <w:r>
         <w:rPr>
           <w:rFonts w:ascii="Arial" w:eastAsia="Arial Unicode MS" w:hAnsi="Arial" w:cs="Arial"/>
-          <w:sz w:val="24"/>
-          <w:szCs w:val="24"/>
           <w:lang w:eastAsia="id-ID"/>
         </w:rPr>
         <w:t>hari_ini_tahun_huruf</w:t>
@@ -689,93 +639,66 @@
       <w:r>
         <w:rPr>
           <w:rFonts w:ascii="Arial" w:eastAsia="Arial Unicode MS" w:hAnsi="Arial" w:cs="Arial"/>
-          <w:sz w:val="24"/>
-          <w:szCs w:val="24"/>
           <w:lang w:eastAsia="id-ID"/>
         </w:rPr>
+        <w:t xml:space="preserve">} </w:t>
+      </w:r>
+      <w:r>
+        <w:rPr>
+          <w:rFonts w:ascii="Arial" w:eastAsia="Arial Unicode MS" w:hAnsi="Arial" w:cs="Arial"/>
+          <w:lang w:val="en-US" w:eastAsia="id-ID"/>
+        </w:rPr>
+        <w:t xml:space="preserve">di </w:t>
+      </w:r>
+      <w:r>
+        <w:rPr>
+          <w:rFonts w:ascii="Arial" w:eastAsia="Arial Unicode MS" w:hAnsi="Arial" w:cs="Arial"/>
+          <w:lang w:eastAsia="id-ID"/>
+        </w:rPr>
+        <w:t>{</w:t>
+      </w:r>
+      <w:proofErr w:type="spellStart"/>
+      <w:r>
+        <w:rPr>
+          <w:rFonts w:ascii="Arial" w:eastAsia="Arial Unicode MS" w:hAnsi="Arial" w:cs="Arial"/>
+          <w:lang w:eastAsia="id-ID"/>
+        </w:rPr>
+        <w:t>lokasi_kegiatan</w:t>
+      </w:r>
+      <w:proofErr w:type="spellEnd"/>
+      <w:r>
+        <w:rPr>
+          <w:rFonts w:ascii="Arial" w:eastAsia="Arial Unicode MS" w:hAnsi="Arial" w:cs="Arial"/>
+          <w:lang w:eastAsia="id-ID"/>
+        </w:rPr>
         <w:t>}</w:t>
       </w:r>
       <w:r>
         <w:rPr>
           <w:rFonts w:ascii="Arial" w:eastAsia="Arial Unicode MS" w:hAnsi="Arial" w:cs="Arial"/>
-          <w:sz w:val="24"/>
-          <w:szCs w:val="24"/>
+          <w:lang w:val="en-US" w:eastAsia="id-ID"/>
+        </w:rPr>
+        <w:t xml:space="preserve">, kami </w:t>
+      </w:r>
+      <w:r>
+        <w:rPr>
+          <w:rFonts w:ascii="Arial" w:eastAsia="Arial Unicode MS" w:hAnsi="Arial" w:cs="Arial"/>
           <w:lang w:eastAsia="id-ID"/>
         </w:rPr>
-        <w:t xml:space="preserve"> </w:t>
-      </w:r>
+        <w:t xml:space="preserve">yang bertanda tangan </w:t>
+      </w:r>
+      <w:proofErr w:type="spellStart"/>
       <w:r>
         <w:rPr>
           <w:rFonts w:ascii="Arial" w:eastAsia="Arial Unicode MS" w:hAnsi="Arial" w:cs="Arial"/>
-          <w:sz w:val="24"/>
-          <w:szCs w:val="24"/>
-          <w:lang w:val="en-US" w:eastAsia="id-ID"/>
-        </w:rPr>
-        <w:t xml:space="preserve">di </w:t>
-      </w:r>
+          <w:lang w:eastAsia="id-ID"/>
+        </w:rPr>
+        <w:t>dibawah</w:t>
+      </w:r>
+      <w:proofErr w:type="spellEnd"/>
       <w:r>
         <w:rPr>
           <w:rFonts w:ascii="Arial" w:eastAsia="Arial Unicode MS" w:hAnsi="Arial" w:cs="Arial"/>
-          <w:sz w:val="24"/>
-          <w:szCs w:val="24"/>
-          <w:lang w:eastAsia="id-ID"/>
-        </w:rPr>
-        <w:t>{</w:t>
-      </w:r>
-      <w:proofErr w:type="spellStart"/>
-      <w:r>
-        <w:rPr>
-          <w:rFonts w:ascii="Arial" w:eastAsia="Arial Unicode MS" w:hAnsi="Arial" w:cs="Arial"/>
-          <w:sz w:val="24"/>
-          <w:szCs w:val="24"/>
-          <w:lang w:eastAsia="id-ID"/>
-        </w:rPr>
-        <w:t>lokasi_kegiatan</w:t>
-      </w:r>
-      <w:proofErr w:type="spellEnd"/>
-      <w:r>
-        <w:rPr>
-          <w:rFonts w:ascii="Arial" w:eastAsia="Arial Unicode MS" w:hAnsi="Arial" w:cs="Arial"/>
-          <w:sz w:val="24"/>
-          <w:szCs w:val="24"/>
-          <w:lang w:eastAsia="id-ID"/>
-        </w:rPr>
-        <w:t>}</w:t>
-      </w:r>
-      <w:r>
-        <w:rPr>
-          <w:rFonts w:ascii="Arial" w:eastAsia="Arial Unicode MS" w:hAnsi="Arial" w:cs="Arial"/>
-          <w:sz w:val="24"/>
-          <w:szCs w:val="24"/>
-          <w:lang w:val="en-US" w:eastAsia="id-ID"/>
-        </w:rPr>
-        <w:t xml:space="preserve">, kami </w:t>
-      </w:r>
-      <w:r>
-        <w:rPr>
-          <w:rFonts w:ascii="Arial" w:eastAsia="Arial Unicode MS" w:hAnsi="Arial" w:cs="Arial"/>
-          <w:sz w:val="24"/>
-          <w:szCs w:val="24"/>
-          <w:lang w:eastAsia="id-ID"/>
-        </w:rPr>
-        <w:t xml:space="preserve">yang bertanda tangan </w:t>
-      </w:r>
-      <w:proofErr w:type="spellStart"/>
-      <w:r>
-        <w:rPr>
-          <w:rFonts w:ascii="Arial" w:eastAsia="Arial Unicode MS" w:hAnsi="Arial" w:cs="Arial"/>
-          <w:sz w:val="24"/>
-          <w:szCs w:val="24"/>
-          <w:lang w:eastAsia="id-ID"/>
-        </w:rPr>
-        <w:t>dibawah</w:t>
-      </w:r>
-      <w:proofErr w:type="spellEnd"/>
-      <w:r>
-        <w:rPr>
-          <w:rFonts w:ascii="Arial" w:eastAsia="Arial Unicode MS" w:hAnsi="Arial" w:cs="Arial"/>
-          <w:sz w:val="24"/>
-          <w:szCs w:val="24"/>
           <w:lang w:eastAsia="id-ID"/>
         </w:rPr>
         <w:t xml:space="preserve"> ini  :</w:t>
@@ -805,16 +728,12 @@
               <w:ind w:left="-109"/>
               <w:rPr>
                 <w:rFonts w:ascii="Arial" w:eastAsia="Arial Unicode MS" w:hAnsi="Arial" w:cs="Arial"/>
-                <w:sz w:val="24"/>
-                <w:szCs w:val="24"/>
                 <w:lang w:val="en-US" w:eastAsia="id-ID"/>
               </w:rPr>
             </w:pPr>
             <w:r>
               <w:rPr>
                 <w:rFonts w:ascii="Arial" w:eastAsia="Arial Unicode MS" w:hAnsi="Arial" w:cs="Arial"/>
-                <w:sz w:val="24"/>
-                <w:szCs w:val="24"/>
                 <w:lang w:val="en-US" w:eastAsia="id-ID"/>
               </w:rPr>
               <w:t>Nama</w:t>
@@ -833,16 +752,12 @@
               <w:spacing w:after="0"/>
               <w:rPr>
                 <w:rFonts w:ascii="Arial" w:eastAsia="Arial Unicode MS" w:hAnsi="Arial" w:cs="Arial"/>
-                <w:sz w:val="24"/>
-                <w:szCs w:val="24"/>
                 <w:lang w:val="en-US" w:eastAsia="id-ID"/>
               </w:rPr>
             </w:pPr>
             <w:r>
               <w:rPr>
                 <w:rFonts w:ascii="Arial" w:eastAsia="Arial Unicode MS" w:hAnsi="Arial" w:cs="Arial"/>
-                <w:sz w:val="24"/>
-                <w:szCs w:val="24"/>
                 <w:lang w:val="en-US" w:eastAsia="id-ID"/>
               </w:rPr>
               <w:t>:</w:t>
@@ -861,16 +776,12 @@
               <w:spacing w:after="0"/>
               <w:rPr>
                 <w:rFonts w:ascii="Arial" w:eastAsia="Arial Unicode MS" w:hAnsi="Arial" w:cs="Arial"/>
-                <w:sz w:val="24"/>
-                <w:szCs w:val="24"/>
                 <w:lang w:val="en-US" w:eastAsia="id-ID"/>
               </w:rPr>
             </w:pPr>
             <w:r>
               <w:rPr>
                 <w:rFonts w:ascii="Arial" w:eastAsia="Arial Unicode MS" w:hAnsi="Arial" w:cs="Arial"/>
-                <w:sz w:val="24"/>
-                <w:szCs w:val="24"/>
                 <w:lang w:eastAsia="id-ID"/>
               </w:rPr>
               <w:t>{</w:t>
@@ -879,8 +790,6 @@
             <w:r>
               <w:rPr>
                 <w:rFonts w:ascii="Arial" w:eastAsia="Arial Unicode MS" w:hAnsi="Arial" w:cs="Arial"/>
-                <w:sz w:val="24"/>
-                <w:szCs w:val="24"/>
                 <w:lang w:eastAsia="id-ID"/>
               </w:rPr>
               <w:t>ketua_tim_nama</w:t>
@@ -889,8 +798,6 @@
             <w:r>
               <w:rPr>
                 <w:rFonts w:ascii="Arial" w:eastAsia="Arial Unicode MS" w:hAnsi="Arial" w:cs="Arial"/>
-                <w:sz w:val="24"/>
-                <w:szCs w:val="24"/>
                 <w:lang w:eastAsia="id-ID"/>
               </w:rPr>
               <w:t>}</w:t>
@@ -912,8 +819,6 @@
               <w:ind w:left="-109"/>
               <w:rPr>
                 <w:rFonts w:ascii="Arial" w:eastAsia="Arial Unicode MS" w:hAnsi="Arial" w:cs="Arial"/>
-                <w:sz w:val="24"/>
-                <w:szCs w:val="24"/>
                 <w:lang w:val="en-US" w:eastAsia="id-ID"/>
               </w:rPr>
             </w:pPr>
@@ -921,8 +826,6 @@
             <w:r>
               <w:rPr>
                 <w:rFonts w:ascii="Arial" w:eastAsia="Arial Unicode MS" w:hAnsi="Arial" w:cs="Arial"/>
-                <w:sz w:val="24"/>
-                <w:szCs w:val="24"/>
                 <w:lang w:val="en-US" w:eastAsia="id-ID"/>
               </w:rPr>
               <w:t>Instansi</w:t>
@@ -942,16 +845,12 @@
               <w:spacing w:after="0"/>
               <w:rPr>
                 <w:rFonts w:ascii="Arial" w:eastAsia="Arial Unicode MS" w:hAnsi="Arial" w:cs="Arial"/>
-                <w:sz w:val="24"/>
-                <w:szCs w:val="24"/>
                 <w:lang w:val="en-US" w:eastAsia="id-ID"/>
               </w:rPr>
             </w:pPr>
             <w:r>
               <w:rPr>
                 <w:rFonts w:ascii="Arial" w:eastAsia="Arial Unicode MS" w:hAnsi="Arial" w:cs="Arial"/>
-                <w:sz w:val="24"/>
-                <w:szCs w:val="24"/>
                 <w:lang w:val="en-US" w:eastAsia="id-ID"/>
               </w:rPr>
               <w:t>:</w:t>
@@ -970,16 +869,12 @@
               <w:spacing w:after="0"/>
               <w:rPr>
                 <w:rFonts w:ascii="Arial" w:eastAsia="Arial Unicode MS" w:hAnsi="Arial" w:cs="Arial"/>
-                <w:sz w:val="24"/>
-                <w:szCs w:val="24"/>
                 <w:lang w:val="en-US" w:eastAsia="id-ID"/>
               </w:rPr>
             </w:pPr>
             <w:r>
               <w:rPr>
                 <w:rFonts w:ascii="Arial" w:eastAsia="Arial Unicode MS" w:hAnsi="Arial" w:cs="Arial"/>
-                <w:sz w:val="24"/>
-                <w:szCs w:val="24"/>
                 <w:lang w:eastAsia="id-ID"/>
               </w:rPr>
               <w:t>{</w:t>
@@ -988,8 +883,6 @@
             <w:r>
               <w:rPr>
                 <w:rFonts w:ascii="Arial" w:eastAsia="Arial Unicode MS" w:hAnsi="Arial" w:cs="Arial"/>
-                <w:sz w:val="24"/>
-                <w:szCs w:val="24"/>
                 <w:lang w:eastAsia="id-ID"/>
               </w:rPr>
               <w:t>ketua_tim_instansi</w:t>
@@ -998,8 +891,6 @@
             <w:r>
               <w:rPr>
                 <w:rFonts w:ascii="Arial" w:eastAsia="Arial Unicode MS" w:hAnsi="Arial" w:cs="Arial"/>
-                <w:sz w:val="24"/>
-                <w:szCs w:val="24"/>
                 <w:lang w:eastAsia="id-ID"/>
               </w:rPr>
               <w:t>}</w:t>
@@ -1021,16 +912,12 @@
               <w:ind w:left="-109"/>
               <w:rPr>
                 <w:rFonts w:ascii="Arial" w:eastAsia="Arial Unicode MS" w:hAnsi="Arial" w:cs="Arial"/>
-                <w:sz w:val="24"/>
-                <w:szCs w:val="24"/>
                 <w:lang w:val="en-US" w:eastAsia="id-ID"/>
               </w:rPr>
             </w:pPr>
             <w:r>
               <w:rPr>
                 <w:rFonts w:ascii="Arial" w:eastAsia="Arial Unicode MS" w:hAnsi="Arial" w:cs="Arial"/>
-                <w:sz w:val="24"/>
-                <w:szCs w:val="24"/>
                 <w:lang w:val="en-US" w:eastAsia="id-ID"/>
               </w:rPr>
               <w:t>NIP</w:t>
@@ -1049,16 +936,12 @@
               <w:spacing w:after="0"/>
               <w:rPr>
                 <w:rFonts w:ascii="Arial" w:eastAsia="Arial Unicode MS" w:hAnsi="Arial" w:cs="Arial"/>
-                <w:sz w:val="24"/>
-                <w:szCs w:val="24"/>
                 <w:lang w:val="en-US" w:eastAsia="id-ID"/>
               </w:rPr>
             </w:pPr>
             <w:r>
               <w:rPr>
                 <w:rFonts w:ascii="Arial" w:eastAsia="Arial Unicode MS" w:hAnsi="Arial" w:cs="Arial"/>
-                <w:sz w:val="24"/>
-                <w:szCs w:val="24"/>
                 <w:lang w:val="en-US" w:eastAsia="id-ID"/>
               </w:rPr>
               <w:t>:</w:t>
@@ -1077,16 +960,12 @@
               <w:spacing w:after="0"/>
               <w:rPr>
                 <w:rFonts w:ascii="Arial" w:eastAsia="Arial Unicode MS" w:hAnsi="Arial" w:cs="Arial"/>
-                <w:sz w:val="24"/>
-                <w:szCs w:val="24"/>
                 <w:lang w:val="en-US" w:eastAsia="id-ID"/>
               </w:rPr>
             </w:pPr>
             <w:r>
               <w:rPr>
                 <w:rFonts w:ascii="Arial" w:hAnsi="Arial" w:cs="Arial"/>
-                <w:sz w:val="24"/>
-                <w:szCs w:val="24"/>
               </w:rPr>
               <w:t>{</w:t>
             </w:r>
@@ -1094,8 +973,6 @@
             <w:r>
               <w:rPr>
                 <w:rFonts w:ascii="Arial" w:hAnsi="Arial" w:cs="Arial"/>
-                <w:sz w:val="24"/>
-                <w:szCs w:val="24"/>
               </w:rPr>
               <w:t>ketua_tim_nip</w:t>
             </w:r>
@@ -1103,8 +980,6 @@
             <w:r>
               <w:rPr>
                 <w:rFonts w:ascii="Arial" w:hAnsi="Arial" w:cs="Arial"/>
-                <w:sz w:val="24"/>
-                <w:szCs w:val="24"/>
               </w:rPr>
               <w:t>}</w:t>
             </w:r>
@@ -1125,8 +1000,6 @@
               <w:ind w:left="-109"/>
               <w:rPr>
                 <w:rFonts w:ascii="Arial" w:eastAsia="Arial Unicode MS" w:hAnsi="Arial" w:cs="Arial"/>
-                <w:sz w:val="24"/>
-                <w:szCs w:val="24"/>
                 <w:lang w:val="en-US" w:eastAsia="id-ID"/>
               </w:rPr>
             </w:pPr>
@@ -1134,8 +1007,6 @@
             <w:r>
               <w:rPr>
                 <w:rFonts w:ascii="Arial" w:eastAsia="Arial Unicode MS" w:hAnsi="Arial" w:cs="Arial"/>
-                <w:sz w:val="24"/>
-                <w:szCs w:val="24"/>
                 <w:lang w:val="en-US" w:eastAsia="id-ID"/>
               </w:rPr>
               <w:t>Jabatan</w:t>
@@ -1155,16 +1026,12 @@
               <w:spacing w:after="0"/>
               <w:rPr>
                 <w:rFonts w:ascii="Arial" w:eastAsia="Arial Unicode MS" w:hAnsi="Arial" w:cs="Arial"/>
-                <w:sz w:val="24"/>
-                <w:szCs w:val="24"/>
                 <w:lang w:val="en-US" w:eastAsia="id-ID"/>
               </w:rPr>
             </w:pPr>
             <w:r>
               <w:rPr>
                 <w:rFonts w:ascii="Arial" w:eastAsia="Arial Unicode MS" w:hAnsi="Arial" w:cs="Arial"/>
-                <w:sz w:val="24"/>
-                <w:szCs w:val="24"/>
                 <w:lang w:val="en-US" w:eastAsia="id-ID"/>
               </w:rPr>
               <w:t>:</w:t>
@@ -1183,16 +1050,12 @@
               <w:spacing w:after="0"/>
               <w:rPr>
                 <w:rFonts w:ascii="Arial" w:eastAsia="Arial Unicode MS" w:hAnsi="Arial" w:cs="Arial"/>
-                <w:sz w:val="24"/>
-                <w:szCs w:val="24"/>
                 <w:lang w:val="en-US" w:eastAsia="id-ID"/>
               </w:rPr>
             </w:pPr>
             <w:r>
               <w:rPr>
                 <w:rFonts w:ascii="Arial" w:eastAsia="Arial Unicode MS" w:hAnsi="Arial" w:cs="Arial"/>
-                <w:sz w:val="24"/>
-                <w:szCs w:val="24"/>
                 <w:lang w:eastAsia="id-ID"/>
               </w:rPr>
               <w:t>{</w:t>
@@ -1201,8 +1064,6 @@
             <w:r>
               <w:rPr>
                 <w:rFonts w:ascii="Arial" w:eastAsia="Arial Unicode MS" w:hAnsi="Arial" w:cs="Arial"/>
-                <w:sz w:val="24"/>
-                <w:szCs w:val="24"/>
                 <w:lang w:eastAsia="id-ID"/>
               </w:rPr>
               <w:t>ketua_tim_jabatan</w:t>
@@ -1211,8 +1072,6 @@
             <w:r>
               <w:rPr>
                 <w:rFonts w:ascii="Arial" w:eastAsia="Arial Unicode MS" w:hAnsi="Arial" w:cs="Arial"/>
-                <w:sz w:val="24"/>
-                <w:szCs w:val="24"/>
                 <w:lang w:eastAsia="id-ID"/>
               </w:rPr>
               <w:t>}</w:t>
@@ -1229,8 +1088,6 @@
         <w:spacing w:after="0"/>
         <w:rPr>
           <w:rFonts w:ascii="Arial" w:eastAsia="Arial Unicode MS" w:hAnsi="Arial" w:cs="Arial"/>
-          <w:sz w:val="24"/>
-          <w:szCs w:val="24"/>
           <w:lang w:val="en-US" w:eastAsia="id-ID"/>
         </w:rPr>
       </w:pPr>
@@ -1238,8 +1095,6 @@
       <w:r>
         <w:rPr>
           <w:rFonts w:ascii="Arial" w:eastAsia="Arial Unicode MS" w:hAnsi="Arial" w:cs="Arial"/>
-          <w:sz w:val="24"/>
-          <w:szCs w:val="24"/>
           <w:lang w:val="en-US" w:eastAsia="id-ID"/>
         </w:rPr>
         <w:t>Beserta</w:t>
@@ -1248,8 +1103,6 @@
       <w:r>
         <w:rPr>
           <w:rFonts w:ascii="Arial" w:eastAsia="Arial Unicode MS" w:hAnsi="Arial" w:cs="Arial"/>
-          <w:sz w:val="24"/>
-          <w:szCs w:val="24"/>
           <w:lang w:val="en-US" w:eastAsia="id-ID"/>
         </w:rPr>
         <w:t xml:space="preserve"> </w:t>
@@ -1259,8 +1112,6 @@
       <w:r>
         <w:rPr>
           <w:rFonts w:ascii="Arial" w:eastAsia="Arial Unicode MS" w:hAnsi="Arial" w:cs="Arial"/>
-          <w:sz w:val="24"/>
-          <w:szCs w:val="24"/>
           <w:lang w:val="en-US" w:eastAsia="id-ID"/>
         </w:rPr>
         <w:t>anggota</w:t>
@@ -1269,8 +1120,6 @@
       <w:r>
         <w:rPr>
           <w:rFonts w:ascii="Arial" w:eastAsia="Arial Unicode MS" w:hAnsi="Arial" w:cs="Arial"/>
-          <w:sz w:val="24"/>
-          <w:szCs w:val="24"/>
           <w:lang w:val="en-US" w:eastAsia="id-ID"/>
         </w:rPr>
         <w:t xml:space="preserve"> :</w:t>
@@ -1284,8 +1133,8 @@
         <w:tblLook w:val="04A0" w:firstRow="1" w:lastRow="0" w:firstColumn="1" w:lastColumn="0" w:noHBand="0" w:noVBand="1"/>
       </w:tblPr>
       <w:tblGrid>
-        <w:gridCol w:w="3419"/>
-        <w:gridCol w:w="2530"/>
+        <w:gridCol w:w="3256"/>
+        <w:gridCol w:w="2693"/>
         <w:gridCol w:w="3544"/>
       </w:tblGrid>
       <w:tr>
@@ -1301,16 +1150,12 @@
               <w:jc w:val="center"/>
               <w:rPr>
                 <w:rFonts w:ascii="Arial" w:eastAsia="Arial Unicode MS" w:hAnsi="Arial" w:cs="Arial"/>
-                <w:sz w:val="24"/>
-                <w:szCs w:val="24"/>
                 <w:lang w:val="en-US" w:eastAsia="id-ID"/>
               </w:rPr>
             </w:pPr>
             <w:r>
               <w:rPr>
                 <w:rFonts w:ascii="Arial" w:eastAsia="Arial Unicode MS" w:hAnsi="Arial" w:cs="Arial"/>
-                <w:sz w:val="24"/>
-                <w:szCs w:val="24"/>
                 <w:lang w:val="en-US" w:eastAsia="id-ID"/>
               </w:rPr>
               <w:t>Nama</w:t>
@@ -1329,16 +1174,12 @@
               <w:jc w:val="center"/>
               <w:rPr>
                 <w:rFonts w:ascii="Arial" w:eastAsia="Arial Unicode MS" w:hAnsi="Arial" w:cs="Arial"/>
-                <w:sz w:val="24"/>
-                <w:szCs w:val="24"/>
                 <w:lang w:val="en-US" w:eastAsia="id-ID"/>
               </w:rPr>
             </w:pPr>
             <w:r>
               <w:rPr>
                 <w:rFonts w:ascii="Arial" w:eastAsia="Arial Unicode MS" w:hAnsi="Arial" w:cs="Arial"/>
-                <w:sz w:val="24"/>
-                <w:szCs w:val="24"/>
                 <w:lang w:val="en-US" w:eastAsia="id-ID"/>
               </w:rPr>
               <w:t>NIP</w:t>
@@ -1357,8 +1198,6 @@
               <w:jc w:val="center"/>
               <w:rPr>
                 <w:rFonts w:ascii="Arial" w:eastAsia="Arial Unicode MS" w:hAnsi="Arial" w:cs="Arial"/>
-                <w:sz w:val="24"/>
-                <w:szCs w:val="24"/>
                 <w:lang w:val="en-US" w:eastAsia="id-ID"/>
               </w:rPr>
             </w:pPr>
@@ -1366,8 +1205,6 @@
             <w:r>
               <w:rPr>
                 <w:rFonts w:ascii="Arial" w:eastAsia="Arial Unicode MS" w:hAnsi="Arial" w:cs="Arial"/>
-                <w:sz w:val="24"/>
-                <w:szCs w:val="24"/>
                 <w:lang w:val="en-US" w:eastAsia="id-ID"/>
               </w:rPr>
               <w:t>Jabatan</w:t>
@@ -1388,16 +1225,12 @@
               </w:tabs>
               <w:rPr>
                 <w:rFonts w:ascii="Arial" w:eastAsia="Arial Unicode MS" w:hAnsi="Arial" w:cs="Arial"/>
-                <w:sz w:val="24"/>
-                <w:szCs w:val="24"/>
                 <w:lang w:val="en-US" w:eastAsia="id-ID"/>
               </w:rPr>
             </w:pPr>
             <w:r>
               <w:rPr>
                 <w:rFonts w:ascii="Arial" w:eastAsia="Arial Unicode MS" w:hAnsi="Arial" w:cs="Arial"/>
-                <w:sz w:val="24"/>
-                <w:szCs w:val="24"/>
                 <w:lang w:eastAsia="id-ID"/>
               </w:rPr>
               <w:t>{#tim_penilai_anggota}{nama}</w:t>
@@ -1416,16 +1249,12 @@
               <w:jc w:val="center"/>
               <w:rPr>
                 <w:rFonts w:ascii="Arial" w:eastAsia="Arial Unicode MS" w:hAnsi="Arial" w:cs="Arial"/>
-                <w:sz w:val="24"/>
-                <w:szCs w:val="24"/>
                 <w:lang w:val="en-US" w:eastAsia="id-ID"/>
               </w:rPr>
             </w:pPr>
             <w:r>
               <w:rPr>
                 <w:rFonts w:ascii="Arial" w:eastAsia="Arial Unicode MS" w:hAnsi="Arial" w:cs="Arial"/>
-                <w:sz w:val="24"/>
-                <w:szCs w:val="24"/>
                 <w:lang w:eastAsia="id-ID"/>
               </w:rPr>
               <w:t>{</w:t>
@@ -1434,8 +1263,6 @@
             <w:r>
               <w:rPr>
                 <w:rFonts w:ascii="Arial" w:eastAsia="Arial Unicode MS" w:hAnsi="Arial" w:cs="Arial"/>
-                <w:sz w:val="24"/>
-                <w:szCs w:val="24"/>
                 <w:lang w:eastAsia="id-ID"/>
               </w:rPr>
               <w:t>nip</w:t>
@@ -1444,8 +1271,6 @@
             <w:r>
               <w:rPr>
                 <w:rFonts w:ascii="Arial" w:eastAsia="Arial Unicode MS" w:hAnsi="Arial" w:cs="Arial"/>
-                <w:sz w:val="24"/>
-                <w:szCs w:val="24"/>
                 <w:lang w:eastAsia="id-ID"/>
               </w:rPr>
               <w:t>}</w:t>
@@ -1463,16 +1288,12 @@
               </w:tabs>
               <w:rPr>
                 <w:rFonts w:ascii="Arial" w:eastAsia="Arial Unicode MS" w:hAnsi="Arial" w:cs="Arial"/>
-                <w:sz w:val="24"/>
-                <w:szCs w:val="24"/>
                 <w:lang w:val="en-US" w:eastAsia="id-ID"/>
               </w:rPr>
             </w:pPr>
             <w:r>
               <w:rPr>
                 <w:rFonts w:ascii="Arial" w:eastAsia="Arial Unicode MS" w:hAnsi="Arial" w:cs="Arial"/>
-                <w:sz w:val="24"/>
-                <w:szCs w:val="24"/>
                 <w:lang w:eastAsia="id-ID"/>
               </w:rPr>
               <w:t>{jabatan}{/</w:t>
@@ -1481,8 +1302,6 @@
             <w:r>
               <w:rPr>
                 <w:rFonts w:ascii="Arial" w:eastAsia="Arial Unicode MS" w:hAnsi="Arial" w:cs="Arial"/>
-                <w:sz w:val="24"/>
-                <w:szCs w:val="24"/>
                 <w:lang w:eastAsia="id-ID"/>
               </w:rPr>
               <w:t>tim_penilai_anggota</w:t>
@@ -1491,8 +1310,6 @@
             <w:r>
               <w:rPr>
                 <w:rFonts w:ascii="Arial" w:eastAsia="Arial Unicode MS" w:hAnsi="Arial" w:cs="Arial"/>
-                <w:sz w:val="24"/>
-                <w:szCs w:val="24"/>
                 <w:lang w:eastAsia="id-ID"/>
               </w:rPr>
               <w:t>}</w:t>
@@ -1505,9 +1322,7 @@
       <w:pPr>
         <w:spacing w:after="0"/>
         <w:rPr>
-          <w:rFonts w:ascii="Times New Roman" w:eastAsia="Arial Unicode MS" w:hAnsi="Times New Roman"/>
-          <w:sz w:val="24"/>
-          <w:szCs w:val="24"/>
+          <w:rFonts w:ascii="Arial" w:eastAsia="Arial Unicode MS" w:hAnsi="Arial" w:cs="Arial"/>
           <w:lang w:val="en-US" w:eastAsia="id-ID"/>
         </w:rPr>
       </w:pPr>
@@ -1517,15 +1332,11 @@
         <w:spacing w:after="0" w:line="240" w:lineRule="auto"/>
         <w:rPr>
           <w:rFonts w:ascii="Arial" w:hAnsi="Arial" w:cs="Arial"/>
-          <w:sz w:val="24"/>
-          <w:szCs w:val="24"/>
         </w:rPr>
       </w:pPr>
       <w:r>
         <w:rPr>
           <w:rFonts w:ascii="Arial" w:hAnsi="Arial" w:cs="Arial"/>
-          <w:sz w:val="24"/>
-          <w:szCs w:val="24"/>
         </w:rPr>
         <w:t>Secara bersama –sama telah melakukan verifikasi terhadap :</w:t>
       </w:r>
@@ -1555,15 +1366,11 @@
               <w:ind w:left="-109"/>
               <w:rPr>
                 <w:rFonts w:ascii="Arial" w:hAnsi="Arial" w:cs="Arial"/>
-                <w:sz w:val="24"/>
-                <w:szCs w:val="24"/>
               </w:rPr>
             </w:pPr>
             <w:r>
               <w:rPr>
                 <w:rFonts w:ascii="Arial" w:hAnsi="Arial" w:cs="Arial"/>
-                <w:sz w:val="24"/>
-                <w:szCs w:val="24"/>
               </w:rPr>
               <w:t>Nama Kegiatan</w:t>
             </w:r>
@@ -1579,15 +1386,11 @@
               <w:jc w:val="center"/>
               <w:rPr>
                 <w:rFonts w:ascii="Arial" w:hAnsi="Arial" w:cs="Arial"/>
-                <w:sz w:val="24"/>
-                <w:szCs w:val="24"/>
               </w:rPr>
             </w:pPr>
             <w:r>
               <w:rPr>
                 <w:rFonts w:ascii="Arial" w:hAnsi="Arial" w:cs="Arial"/>
-                <w:sz w:val="24"/>
-                <w:szCs w:val="24"/>
               </w:rPr>
               <w:t>:</w:t>
             </w:r>
@@ -1603,16 +1406,12 @@
               <w:spacing w:after="0" w:line="240" w:lineRule="auto"/>
               <w:rPr>
                 <w:rFonts w:ascii="Arial" w:hAnsi="Arial" w:cs="Arial"/>
-                <w:sz w:val="24"/>
-                <w:szCs w:val="24"/>
                 <w:lang w:eastAsia="ar-SA"/>
               </w:rPr>
             </w:pPr>
             <w:r>
               <w:rPr>
                 <w:rFonts w:ascii="Arial" w:hAnsi="Arial" w:cs="Arial"/>
-                <w:sz w:val="24"/>
-                <w:szCs w:val="24"/>
                 <w:lang w:eastAsia="ar-SA"/>
               </w:rPr>
               <w:t>{</w:t>
@@ -1621,8 +1420,6 @@
             <w:r>
               <w:rPr>
                 <w:rFonts w:ascii="Arial" w:hAnsi="Arial" w:cs="Arial"/>
-                <w:sz w:val="24"/>
-                <w:szCs w:val="24"/>
                 <w:lang w:eastAsia="ar-SA"/>
               </w:rPr>
               <w:t>nama_kegiatan</w:t>
@@ -1631,8 +1428,6 @@
             <w:r>
               <w:rPr>
                 <w:rFonts w:ascii="Arial" w:hAnsi="Arial" w:cs="Arial"/>
-                <w:sz w:val="24"/>
-                <w:szCs w:val="24"/>
                 <w:lang w:eastAsia="ar-SA"/>
               </w:rPr>
               <w:t>}</w:t>
@@ -1654,15 +1449,11 @@
               <w:ind w:left="-109"/>
               <w:rPr>
                 <w:rFonts w:ascii="Arial" w:hAnsi="Arial" w:cs="Arial"/>
-                <w:sz w:val="24"/>
-                <w:szCs w:val="24"/>
               </w:rPr>
             </w:pPr>
             <w:r>
               <w:rPr>
                 <w:rFonts w:ascii="Arial" w:hAnsi="Arial" w:cs="Arial"/>
-                <w:sz w:val="24"/>
-                <w:szCs w:val="24"/>
               </w:rPr>
               <w:t>Alamat Kegiatan</w:t>
             </w:r>
@@ -1678,15 +1469,11 @@
               <w:jc w:val="center"/>
               <w:rPr>
                 <w:rFonts w:ascii="Arial" w:hAnsi="Arial" w:cs="Arial"/>
-                <w:sz w:val="24"/>
-                <w:szCs w:val="24"/>
               </w:rPr>
             </w:pPr>
             <w:r>
               <w:rPr>
                 <w:rFonts w:ascii="Arial" w:hAnsi="Arial" w:cs="Arial"/>
-                <w:sz w:val="24"/>
-                <w:szCs w:val="24"/>
               </w:rPr>
               <w:t>:</w:t>
             </w:r>
@@ -1709,15 +1496,11 @@
               <w:jc w:val="both"/>
               <w:rPr>
                 <w:rFonts w:ascii="Arial" w:hAnsi="Arial" w:cs="Arial"/>
-                <w:sz w:val="24"/>
-                <w:szCs w:val="24"/>
               </w:rPr>
             </w:pPr>
             <w:r>
               <w:rPr>
                 <w:rFonts w:ascii="Arial" w:eastAsia="Arial Unicode MS" w:hAnsi="Arial" w:cs="Arial"/>
-                <w:sz w:val="24"/>
-                <w:szCs w:val="24"/>
                 <w:lang w:eastAsia="id-ID"/>
               </w:rPr>
               <w:t>{</w:t>
@@ -1726,8 +1509,6 @@
             <w:r>
               <w:rPr>
                 <w:rFonts w:ascii="Arial" w:eastAsia="Arial Unicode MS" w:hAnsi="Arial" w:cs="Arial"/>
-                <w:sz w:val="24"/>
-                <w:szCs w:val="24"/>
                 <w:lang w:eastAsia="id-ID"/>
               </w:rPr>
               <w:t>lokasi_kegiatan</w:t>
@@ -1736,8 +1517,6 @@
             <w:r>
               <w:rPr>
                 <w:rFonts w:ascii="Arial" w:eastAsia="Arial Unicode MS" w:hAnsi="Arial" w:cs="Arial"/>
-                <w:sz w:val="24"/>
-                <w:szCs w:val="24"/>
                 <w:lang w:eastAsia="id-ID"/>
               </w:rPr>
               <w:t>}</w:t>
@@ -1756,15 +1535,11 @@
               <w:ind w:left="-109"/>
               <w:rPr>
                 <w:rFonts w:ascii="Arial" w:hAnsi="Arial" w:cs="Arial"/>
-                <w:sz w:val="24"/>
-                <w:szCs w:val="24"/>
               </w:rPr>
             </w:pPr>
             <w:r>
               <w:rPr>
                 <w:rFonts w:ascii="Arial" w:hAnsi="Arial" w:cs="Arial"/>
-                <w:sz w:val="24"/>
-                <w:szCs w:val="24"/>
               </w:rPr>
               <w:t>Jenis kegiatan usaha</w:t>
             </w:r>
@@ -1780,15 +1555,11 @@
               <w:jc w:val="center"/>
               <w:rPr>
                 <w:rFonts w:ascii="Arial" w:hAnsi="Arial" w:cs="Arial"/>
-                <w:sz w:val="24"/>
-                <w:szCs w:val="24"/>
               </w:rPr>
             </w:pPr>
             <w:r>
               <w:rPr>
                 <w:rFonts w:ascii="Arial" w:hAnsi="Arial" w:cs="Arial"/>
-                <w:sz w:val="24"/>
-                <w:szCs w:val="24"/>
               </w:rPr>
               <w:t>:</w:t>
             </w:r>
@@ -1804,16 +1575,12 @@
               <w:spacing w:after="0" w:line="240" w:lineRule="auto"/>
               <w:rPr>
                 <w:rFonts w:ascii="Arial" w:hAnsi="Arial" w:cs="Arial"/>
-                <w:sz w:val="24"/>
-                <w:szCs w:val="24"/>
                 <w:lang w:val="en-US"/>
               </w:rPr>
             </w:pPr>
             <w:r>
               <w:rPr>
                 <w:rFonts w:ascii="Arial" w:hAnsi="Arial" w:cs="Arial"/>
-                <w:sz w:val="24"/>
-                <w:szCs w:val="24"/>
                 <w:lang w:eastAsia="ar-SA"/>
               </w:rPr>
               <w:t>{</w:t>
@@ -1822,8 +1589,6 @@
             <w:r>
               <w:rPr>
                 <w:rFonts w:ascii="Arial" w:hAnsi="Arial" w:cs="Arial"/>
-                <w:sz w:val="24"/>
-                <w:szCs w:val="24"/>
                 <w:lang w:eastAsia="ar-SA"/>
               </w:rPr>
               <w:t>jenis_kegiatan</w:t>
@@ -1832,8 +1597,6 @@
             <w:r>
               <w:rPr>
                 <w:rFonts w:ascii="Arial" w:hAnsi="Arial" w:cs="Arial"/>
-                <w:sz w:val="24"/>
-                <w:szCs w:val="24"/>
                 <w:lang w:eastAsia="ar-SA"/>
               </w:rPr>
               <w:t>}</w:t>
@@ -1852,16 +1615,12 @@
               <w:ind w:left="-109"/>
               <w:rPr>
                 <w:rFonts w:ascii="Arial" w:hAnsi="Arial" w:cs="Arial"/>
-                <w:sz w:val="24"/>
-                <w:szCs w:val="24"/>
               </w:rPr>
             </w:pPr>
             <w:proofErr w:type="spellStart"/>
             <w:r>
               <w:rPr>
                 <w:rFonts w:ascii="Arial" w:hAnsi="Arial" w:cs="Arial"/>
-                <w:sz w:val="24"/>
-                <w:szCs w:val="24"/>
               </w:rPr>
               <w:t>Telp</w:t>
             </w:r>
@@ -1869,8 +1628,6 @@
             <w:r>
               <w:rPr>
                 <w:rFonts w:ascii="Arial" w:hAnsi="Arial" w:cs="Arial"/>
-                <w:sz w:val="24"/>
-                <w:szCs w:val="24"/>
               </w:rPr>
               <w:t>/</w:t>
             </w:r>
@@ -1878,8 +1635,6 @@
             <w:r>
               <w:rPr>
                 <w:rFonts w:ascii="Arial" w:hAnsi="Arial" w:cs="Arial"/>
-                <w:sz w:val="24"/>
-                <w:szCs w:val="24"/>
               </w:rPr>
               <w:t>Fax</w:t>
             </w:r>
@@ -1896,15 +1651,11 @@
               <w:jc w:val="center"/>
               <w:rPr>
                 <w:rFonts w:ascii="Arial" w:hAnsi="Arial" w:cs="Arial"/>
-                <w:sz w:val="24"/>
-                <w:szCs w:val="24"/>
               </w:rPr>
             </w:pPr>
             <w:r>
               <w:rPr>
                 <w:rFonts w:ascii="Arial" w:hAnsi="Arial" w:cs="Arial"/>
-                <w:sz w:val="24"/>
-                <w:szCs w:val="24"/>
               </w:rPr>
               <w:t>:</w:t>
             </w:r>
@@ -1920,15 +1671,11 @@
               <w:spacing w:after="0" w:line="240" w:lineRule="auto"/>
               <w:rPr>
                 <w:rFonts w:ascii="Arial" w:hAnsi="Arial" w:cs="Arial"/>
-                <w:sz w:val="24"/>
-                <w:szCs w:val="24"/>
               </w:rPr>
             </w:pPr>
             <w:r>
               <w:rPr>
                 <w:rFonts w:ascii="Arial" w:hAnsi="Arial" w:cs="Arial"/>
-                <w:sz w:val="24"/>
-                <w:szCs w:val="24"/>
               </w:rPr>
               <w:t>{</w:t>
             </w:r>
@@ -1936,8 +1683,6 @@
             <w:r>
               <w:rPr>
                 <w:rFonts w:ascii="Arial" w:hAnsi="Arial" w:cs="Arial"/>
-                <w:sz w:val="24"/>
-                <w:szCs w:val="24"/>
               </w:rPr>
               <w:t>telepon_pemrakarsa</w:t>
             </w:r>
@@ -1945,8 +1690,6 @@
             <w:r>
               <w:rPr>
                 <w:rFonts w:ascii="Arial" w:hAnsi="Arial" w:cs="Arial"/>
-                <w:sz w:val="24"/>
-                <w:szCs w:val="24"/>
               </w:rPr>
               <w:t>}</w:t>
             </w:r>
@@ -1964,15 +1707,11 @@
               <w:ind w:left="-109"/>
               <w:rPr>
                 <w:rFonts w:ascii="Arial" w:hAnsi="Arial" w:cs="Arial"/>
-                <w:sz w:val="24"/>
-                <w:szCs w:val="24"/>
               </w:rPr>
             </w:pPr>
             <w:r>
               <w:rPr>
                 <w:rFonts w:ascii="Arial" w:hAnsi="Arial" w:cs="Arial"/>
-                <w:sz w:val="24"/>
-                <w:szCs w:val="24"/>
               </w:rPr>
               <w:t>E-Mail</w:t>
             </w:r>
@@ -1988,15 +1727,11 @@
               <w:jc w:val="center"/>
               <w:rPr>
                 <w:rFonts w:ascii="Arial" w:hAnsi="Arial" w:cs="Arial"/>
-                <w:sz w:val="24"/>
-                <w:szCs w:val="24"/>
               </w:rPr>
             </w:pPr>
             <w:r>
               <w:rPr>
                 <w:rFonts w:ascii="Arial" w:hAnsi="Arial" w:cs="Arial"/>
-                <w:sz w:val="24"/>
-                <w:szCs w:val="24"/>
               </w:rPr>
               <w:t>:</w:t>
             </w:r>
@@ -2012,15 +1747,11 @@
               <w:spacing w:after="0" w:line="240" w:lineRule="auto"/>
               <w:rPr>
                 <w:rFonts w:ascii="Arial" w:hAnsi="Arial" w:cs="Arial"/>
-                <w:sz w:val="24"/>
-                <w:szCs w:val="24"/>
               </w:rPr>
             </w:pPr>
             <w:r>
               <w:rPr>
                 <w:rFonts w:ascii="Arial" w:hAnsi="Arial" w:cs="Arial"/>
-                <w:sz w:val="24"/>
-                <w:szCs w:val="24"/>
               </w:rPr>
               <w:t>-</w:t>
             </w:r>
@@ -2042,15 +1773,11 @@
               <w:ind w:left="-109"/>
               <w:rPr>
                 <w:rFonts w:ascii="Arial" w:hAnsi="Arial" w:cs="Arial"/>
-                <w:sz w:val="24"/>
-                <w:szCs w:val="24"/>
               </w:rPr>
             </w:pPr>
             <w:r>
               <w:rPr>
                 <w:rFonts w:ascii="Arial" w:hAnsi="Arial" w:cs="Arial"/>
-                <w:sz w:val="24"/>
-                <w:szCs w:val="24"/>
               </w:rPr>
               <w:t>Pihak Perusahaan</w:t>
             </w:r>
@@ -2067,8 +1794,6 @@
               <w:ind w:left="-109"/>
               <w:rPr>
                 <w:rFonts w:ascii="Arial" w:hAnsi="Arial" w:cs="Arial"/>
-                <w:sz w:val="24"/>
-                <w:szCs w:val="24"/>
               </w:rPr>
             </w:pPr>
           </w:p>
@@ -2085,15 +1810,11 @@
               <w:ind w:left="-109"/>
               <w:rPr>
                 <w:rFonts w:ascii="Arial" w:hAnsi="Arial" w:cs="Arial"/>
-                <w:sz w:val="24"/>
-                <w:szCs w:val="24"/>
               </w:rPr>
             </w:pPr>
             <w:r>
               <w:rPr>
                 <w:rFonts w:ascii="Arial" w:hAnsi="Arial" w:cs="Arial"/>
-                <w:sz w:val="24"/>
-                <w:szCs w:val="24"/>
               </w:rPr>
               <w:t>Nama</w:t>
             </w:r>
@@ -2110,15 +1831,11 @@
               <w:jc w:val="center"/>
               <w:rPr>
                 <w:rFonts w:ascii="Arial" w:hAnsi="Arial" w:cs="Arial"/>
-                <w:sz w:val="24"/>
-                <w:szCs w:val="24"/>
               </w:rPr>
             </w:pPr>
             <w:r>
               <w:rPr>
                 <w:rFonts w:ascii="Arial" w:hAnsi="Arial" w:cs="Arial"/>
-                <w:sz w:val="24"/>
-                <w:szCs w:val="24"/>
               </w:rPr>
               <w:t>:</w:t>
             </w:r>
@@ -2135,16 +1852,12 @@
               <w:ind w:left="-109"/>
               <w:rPr>
                 <w:rFonts w:ascii="Arial" w:hAnsi="Arial" w:cs="Arial"/>
-                <w:sz w:val="24"/>
-                <w:szCs w:val="24"/>
                 <w:lang w:val="en-US"/>
               </w:rPr>
             </w:pPr>
             <w:r>
               <w:rPr>
                 <w:rFonts w:ascii="Arial" w:hAnsi="Arial" w:cs="Arial"/>
-                <w:sz w:val="24"/>
-                <w:szCs w:val="24"/>
               </w:rPr>
               <w:t>{</w:t>
             </w:r>
@@ -2152,8 +1865,6 @@
             <w:r>
               <w:rPr>
                 <w:rFonts w:ascii="Arial" w:hAnsi="Arial" w:cs="Arial"/>
-                <w:sz w:val="24"/>
-                <w:szCs w:val="24"/>
               </w:rPr>
               <w:t>nama_pemrakarsa</w:t>
             </w:r>
@@ -2161,8 +1872,6 @@
             <w:r>
               <w:rPr>
                 <w:rFonts w:ascii="Arial" w:hAnsi="Arial" w:cs="Arial"/>
-                <w:sz w:val="24"/>
-                <w:szCs w:val="24"/>
               </w:rPr>
               <w:t>}</w:t>
             </w:r>
@@ -2180,15 +1889,11 @@
               <w:ind w:left="-109"/>
               <w:rPr>
                 <w:rFonts w:ascii="Arial" w:hAnsi="Arial" w:cs="Arial"/>
-                <w:sz w:val="24"/>
-                <w:szCs w:val="24"/>
               </w:rPr>
             </w:pPr>
             <w:r>
               <w:rPr>
                 <w:rFonts w:ascii="Arial" w:hAnsi="Arial" w:cs="Arial"/>
-                <w:sz w:val="24"/>
-                <w:szCs w:val="24"/>
               </w:rPr>
               <w:t>Jabatan</w:t>
             </w:r>
@@ -2205,15 +1910,11 @@
               <w:jc w:val="center"/>
               <w:rPr>
                 <w:rFonts w:ascii="Arial" w:hAnsi="Arial" w:cs="Arial"/>
-                <w:sz w:val="24"/>
-                <w:szCs w:val="24"/>
               </w:rPr>
             </w:pPr>
             <w:r>
               <w:rPr>
                 <w:rFonts w:ascii="Arial" w:hAnsi="Arial" w:cs="Arial"/>
-                <w:sz w:val="24"/>
-                <w:szCs w:val="24"/>
               </w:rPr>
               <w:t>:</w:t>
             </w:r>
@@ -2230,16 +1931,12 @@
               <w:ind w:left="-109"/>
               <w:rPr>
                 <w:rFonts w:ascii="Arial" w:hAnsi="Arial" w:cs="Arial"/>
-                <w:sz w:val="24"/>
-                <w:szCs w:val="24"/>
                 <w:lang w:val="en-US"/>
               </w:rPr>
             </w:pPr>
             <w:r>
               <w:rPr>
                 <w:rFonts w:ascii="Arial" w:hAnsi="Arial" w:cs="Arial"/>
-                <w:sz w:val="24"/>
-                <w:szCs w:val="24"/>
               </w:rPr>
               <w:t>{</w:t>
             </w:r>
@@ -2247,8 +1944,6 @@
             <w:r>
               <w:rPr>
                 <w:rFonts w:ascii="Arial" w:hAnsi="Arial" w:cs="Arial"/>
-                <w:sz w:val="24"/>
-                <w:szCs w:val="24"/>
               </w:rPr>
               <w:t>jabatan_pemrakarsa</w:t>
             </w:r>
@@ -2256,8 +1951,6 @@
             <w:r>
               <w:rPr>
                 <w:rFonts w:ascii="Arial" w:hAnsi="Arial" w:cs="Arial"/>
-                <w:sz w:val="24"/>
-                <w:szCs w:val="24"/>
               </w:rPr>
               <w:t>}</w:t>
             </w:r>
@@ -2275,16 +1968,12 @@
               <w:ind w:left="-109"/>
               <w:rPr>
                 <w:rFonts w:ascii="Arial" w:hAnsi="Arial" w:cs="Arial"/>
-                <w:sz w:val="24"/>
-                <w:szCs w:val="24"/>
               </w:rPr>
             </w:pPr>
             <w:proofErr w:type="spellStart"/>
             <w:r>
               <w:rPr>
                 <w:rFonts w:ascii="Arial" w:hAnsi="Arial" w:cs="Arial"/>
-                <w:sz w:val="24"/>
-                <w:szCs w:val="24"/>
               </w:rPr>
               <w:t>No.HP</w:t>
             </w:r>
@@ -2302,16 +1991,12 @@
               <w:jc w:val="center"/>
               <w:rPr>
                 <w:rFonts w:ascii="Arial" w:hAnsi="Arial" w:cs="Arial"/>
-                <w:sz w:val="24"/>
-                <w:szCs w:val="24"/>
                 <w:lang w:val="en-US"/>
               </w:rPr>
             </w:pPr>
             <w:r>
               <w:rPr>
                 <w:rFonts w:ascii="Arial" w:hAnsi="Arial" w:cs="Arial"/>
-                <w:sz w:val="24"/>
-                <w:szCs w:val="24"/>
                 <w:lang w:val="en-US"/>
               </w:rPr>
               <w:t>:</w:t>
@@ -2329,16 +2014,12 @@
               <w:ind w:left="-109"/>
               <w:rPr>
                 <w:rFonts w:ascii="Arial" w:hAnsi="Arial" w:cs="Arial"/>
-                <w:sz w:val="24"/>
-                <w:szCs w:val="24"/>
                 <w:lang w:val="en-US"/>
               </w:rPr>
             </w:pPr>
             <w:r>
               <w:rPr>
                 <w:rFonts w:ascii="Arial" w:hAnsi="Arial" w:cs="Arial"/>
-                <w:sz w:val="24"/>
-                <w:szCs w:val="24"/>
               </w:rPr>
               <w:t>{</w:t>
             </w:r>
@@ -2346,8 +2027,6 @@
             <w:r>
               <w:rPr>
                 <w:rFonts w:ascii="Arial" w:hAnsi="Arial" w:cs="Arial"/>
-                <w:sz w:val="24"/>
-                <w:szCs w:val="24"/>
               </w:rPr>
               <w:t>telepon_pemrakarsa</w:t>
             </w:r>
@@ -2355,8 +2034,6 @@
             <w:r>
               <w:rPr>
                 <w:rFonts w:ascii="Arial" w:hAnsi="Arial" w:cs="Arial"/>
-                <w:sz w:val="24"/>
-                <w:szCs w:val="24"/>
               </w:rPr>
               <w:t>}</w:t>
             </w:r>
@@ -2374,15 +2051,11 @@
               <w:ind w:left="-109"/>
               <w:rPr>
                 <w:rFonts w:ascii="Arial" w:hAnsi="Arial" w:cs="Arial"/>
-                <w:sz w:val="24"/>
-                <w:szCs w:val="24"/>
               </w:rPr>
             </w:pPr>
             <w:r>
               <w:rPr>
                 <w:rFonts w:ascii="Arial" w:hAnsi="Arial" w:cs="Arial"/>
-                <w:sz w:val="24"/>
-                <w:szCs w:val="24"/>
               </w:rPr>
               <w:t>E-Mail</w:t>
             </w:r>
@@ -2399,15 +2072,11 @@
               <w:jc w:val="center"/>
               <w:rPr>
                 <w:rFonts w:ascii="Arial" w:hAnsi="Arial" w:cs="Arial"/>
-                <w:sz w:val="24"/>
-                <w:szCs w:val="24"/>
               </w:rPr>
             </w:pPr>
             <w:r>
               <w:rPr>
                 <w:rFonts w:ascii="Arial" w:hAnsi="Arial" w:cs="Arial"/>
-                <w:sz w:val="24"/>
-                <w:szCs w:val="24"/>
               </w:rPr>
               <w:t>:</w:t>
             </w:r>
@@ -2424,15 +2093,11 @@
               <w:ind w:left="-109"/>
               <w:rPr>
                 <w:rFonts w:ascii="Arial" w:hAnsi="Arial" w:cs="Arial"/>
-                <w:sz w:val="24"/>
-                <w:szCs w:val="24"/>
               </w:rPr>
             </w:pPr>
             <w:r>
               <w:rPr>
                 <w:rFonts w:ascii="Arial" w:hAnsi="Arial" w:cs="Arial"/>
-                <w:sz w:val="24"/>
-                <w:szCs w:val="24"/>
               </w:rPr>
               <w:t>{</w:t>
             </w:r>
@@ -2440,8 +2105,6 @@
             <w:r>
               <w:rPr>
                 <w:rFonts w:ascii="Arial" w:hAnsi="Arial" w:cs="Arial"/>
-                <w:sz w:val="24"/>
-                <w:szCs w:val="24"/>
               </w:rPr>
               <w:t>email_pemrakarsa</w:t>
             </w:r>
@@ -2449,8 +2112,6 @@
             <w:r>
               <w:rPr>
                 <w:rFonts w:ascii="Arial" w:hAnsi="Arial" w:cs="Arial"/>
-                <w:sz w:val="24"/>
-                <w:szCs w:val="24"/>
               </w:rPr>
               <w:t>}</w:t>
             </w:r>
@@ -2471,129 +2132,104 @@
       <w:r>
         <w:rPr>
           <w:rFonts w:ascii="Arial" w:hAnsi="Arial" w:cs="Arial"/>
-          <w:sz w:val="24"/>
-          <w:szCs w:val="24"/>
         </w:rPr>
         <w:t xml:space="preserve">Verifikasi dilakukan berkaitan dengan pemenuhan </w:t>
       </w:r>
       <w:proofErr w:type="spellStart"/>
       <w:r>
+        <w:rPr>
+          <w:rFonts w:ascii="Arial" w:hAnsi="Arial" w:cs="Arial"/>
+          <w:lang w:val="en-US"/>
+        </w:rPr>
+        <w:t>Penerbitan</w:t>
+      </w:r>
+      <w:proofErr w:type="spellEnd"/>
+      <w:r>
+        <w:rPr>
+          <w:rFonts w:ascii="Arial" w:hAnsi="Arial" w:cs="Arial"/>
+          <w:lang w:val="en-US"/>
+        </w:rPr>
+        <w:t xml:space="preserve"> </w:t>
+      </w:r>
+      <w:proofErr w:type="spellStart"/>
+      <w:r>
+        <w:rPr>
+          <w:rFonts w:ascii="Arial" w:hAnsi="Arial" w:cs="Arial"/>
+          <w:lang w:val="en-US"/>
+        </w:rPr>
+        <w:t>Persetujuan</w:t>
+      </w:r>
+      <w:proofErr w:type="spellEnd"/>
+      <w:r>
+        <w:rPr>
+          <w:rFonts w:ascii="Arial" w:hAnsi="Arial" w:cs="Arial"/>
+          <w:lang w:val="en-US"/>
+        </w:rPr>
+        <w:t xml:space="preserve"> </w:t>
+      </w:r>
+      <w:r>
+        <w:rPr>
+          <w:rFonts w:ascii="Arial" w:hAnsi="Arial" w:cs="Arial"/>
+        </w:rPr>
+        <w:t xml:space="preserve"> </w:t>
+      </w:r>
+      <w:r>
+        <w:rPr>
+          <w:rFonts w:ascii="Arial" w:eastAsia="Arial Unicode MS" w:hAnsi="Arial" w:cs="Arial"/>
+        </w:rPr>
+        <w:t>{</w:t>
+      </w:r>
+      <w:proofErr w:type="spellStart"/>
+      <w:r>
+        <w:rPr>
+          <w:rFonts w:ascii="Arial" w:eastAsia="Arial Unicode MS" w:hAnsi="Arial" w:cs="Arial"/>
+        </w:rPr>
+        <w:t>jenis_dokumen</w:t>
+      </w:r>
+      <w:proofErr w:type="spellEnd"/>
+      <w:r>
+        <w:rPr>
+          <w:rFonts w:ascii="Arial" w:eastAsia="Arial Unicode MS" w:hAnsi="Arial" w:cs="Arial"/>
+        </w:rPr>
+        <w:t xml:space="preserve">} </w:t>
+      </w:r>
+      <w:r>
+        <w:rPr>
+          <w:rFonts w:ascii="Arial" w:hAnsi="Arial" w:cs="Arial"/>
+        </w:rPr>
+        <w:t xml:space="preserve"> </w:t>
+      </w:r>
+      <w:r>
+        <w:rPr>
+          <w:rFonts w:ascii="Arial" w:hAnsi="Arial" w:cs="Arial"/>
+        </w:rPr>
+        <w:t>sesuai peraturan</w:t>
+      </w:r>
+      <w:r>
+        <w:rPr>
+          <w:rFonts w:ascii="Arial" w:hAnsi="Arial" w:cs="Arial"/>
+          <w:lang w:val="en-US"/>
+        </w:rPr>
+        <w:t xml:space="preserve"> </w:t>
+      </w:r>
+      <w:r>
+        <w:rPr>
+          <w:rFonts w:ascii="Arial" w:hAnsi="Arial" w:cs="Arial"/>
+        </w:rPr>
+        <w:t>Perundang-undangan yang berlaku. Catatan selama pelaksanaan Verifikasi disajikan dalam lampiran Berita Acara dan menjadi bagian yang tidak terpisahkan dari Berita Acara ini.</w:t>
+      </w:r>
+    </w:p>
+    <w:p>
+      <w:pPr>
+        <w:spacing w:after="0"/>
+        <w:jc w:val="both"/>
         <w:rPr>
           <w:rFonts w:ascii="Arial" w:hAnsi="Arial" w:cs="Arial"/>
           <w:sz w:val="24"/>
           <w:szCs w:val="24"/>
-          <w:lang w:val="en-US"/>
-        </w:rPr>
-        <w:t>Penerbitan</w:t>
-      </w:r>
-      <w:proofErr w:type="spellEnd"/>
-      <w:r>
-        <w:rPr>
-          <w:rFonts w:ascii="Arial" w:hAnsi="Arial" w:cs="Arial"/>
-          <w:sz w:val="24"/>
-          <w:szCs w:val="24"/>
-          <w:lang w:val="en-US"/>
-        </w:rPr>
-        <w:t xml:space="preserve"> </w:t>
-      </w:r>
-      <w:proofErr w:type="spellStart"/>
-      <w:r>
-        <w:rPr>
-          <w:rFonts w:ascii="Arial" w:hAnsi="Arial" w:cs="Arial"/>
-          <w:sz w:val="24"/>
-          <w:szCs w:val="24"/>
-          <w:lang w:val="en-US"/>
-        </w:rPr>
-        <w:t>Persetujuan</w:t>
-      </w:r>
-      <w:proofErr w:type="spellEnd"/>
-      <w:r>
-        <w:rPr>
-          <w:rFonts w:ascii="Arial" w:hAnsi="Arial" w:cs="Arial"/>
-          <w:sz w:val="24"/>
-          <w:szCs w:val="24"/>
-          <w:lang w:val="en-US"/>
-        </w:rPr>
-        <w:t xml:space="preserve"> </w:t>
-      </w:r>
-      <w:r>
-        <w:rPr>
-          <w:rFonts w:ascii="Arial" w:hAnsi="Arial" w:cs="Arial"/>
-          <w:sz w:val="24"/>
-          <w:szCs w:val="24"/>
-        </w:rPr>
-        <w:t xml:space="preserve"> </w:t>
-      </w:r>
-      <w:r>
-        <w:rPr>
-          <w:rFonts w:ascii="Arial" w:eastAsia="Arial Unicode MS" w:hAnsi="Arial" w:cs="Arial"/>
-          <w:sz w:val="24"/>
-          <w:szCs w:val="24"/>
-        </w:rPr>
-        <w:t>{</w:t>
-      </w:r>
-      <w:proofErr w:type="spellStart"/>
-      <w:r>
-        <w:rPr>
-          <w:rFonts w:ascii="Arial" w:eastAsia="Arial Unicode MS" w:hAnsi="Arial" w:cs="Arial"/>
-          <w:sz w:val="24"/>
-          <w:szCs w:val="24"/>
-        </w:rPr>
-        <w:t>jenis_dokumen</w:t>
-      </w:r>
-      <w:proofErr w:type="spellEnd"/>
-      <w:r>
-        <w:rPr>
-          <w:rFonts w:ascii="Arial" w:eastAsia="Arial Unicode MS" w:hAnsi="Arial" w:cs="Arial"/>
-          <w:sz w:val="24"/>
-          <w:szCs w:val="24"/>
-        </w:rPr>
-        <w:t xml:space="preserve">} </w:t>
-      </w:r>
-      <w:r>
-        <w:rPr>
-          <w:rFonts w:ascii="Arial" w:hAnsi="Arial" w:cs="Arial"/>
-          <w:sz w:val="24"/>
-          <w:szCs w:val="24"/>
-        </w:rPr>
-        <w:t xml:space="preserve"> </w:t>
-      </w:r>
-      <w:r>
-        <w:rPr>
-          <w:rFonts w:ascii="Arial" w:hAnsi="Arial" w:cs="Arial"/>
-          <w:sz w:val="24"/>
-          <w:szCs w:val="24"/>
-        </w:rPr>
-        <w:t>sesuai peraturan</w:t>
-      </w:r>
-      <w:r>
-        <w:rPr>
-          <w:rFonts w:ascii="Arial" w:hAnsi="Arial" w:cs="Arial"/>
-          <w:sz w:val="24"/>
-          <w:szCs w:val="24"/>
-          <w:lang w:val="en-US"/>
-        </w:rPr>
-        <w:t xml:space="preserve"> </w:t>
-      </w:r>
-      <w:r>
-        <w:rPr>
-          <w:rFonts w:ascii="Arial" w:hAnsi="Arial" w:cs="Arial"/>
-          <w:sz w:val="24"/>
-          <w:szCs w:val="24"/>
-        </w:rPr>
-        <w:t>Perundang-undangan yang berlaku. Catatan selama pelaksanaan Verifikasi disajikan dalam lampiran Berita Acara dan menjadi bagian yang tidak terpisahkan dari Berita Acara ini.</w:t>
-      </w:r>
-    </w:p>
-    <w:p>
-      <w:pPr>
-        <w:spacing w:after="0"/>
-        <w:jc w:val="both"/>
-        <w:rPr>
-          <w:rFonts w:ascii="Arial" w:hAnsi="Arial" w:cs="Arial"/>
-          <w:sz w:val="24"/>
-          <w:szCs w:val="24"/>
         </w:rPr>
         <w:sectPr>
+          <w:footerReference w:type="default" r:id="rId10"/>
           <w:pgSz w:w="11907" w:h="16839" w:code="9"/>
           <w:pgMar w:top="142" w:right="992" w:bottom="567" w:left="1134" w:header="709" w:footer="57" w:gutter="0"/>
           <w:cols w:space="708"/>
@@ -2920,6 +2556,159 @@
     </w:p>
   </w:endnote>
 </w:endnotes>
+</file>
+
+<file path=word/footer1.xml><?xml version="1.0" encoding="utf-8"?>
+<w:ftr xmlns:wpc="http://schemas.microsoft.com/office/word/2010/wordprocessingCanvas" xmlns:cx="http://schemas.microsoft.com/office/drawing/2014/chartex" xmlns:cx1="http://schemas.microsoft.com/office/drawing/2015/9/8/chartex" xmlns:cx2="http://schemas.microsoft.com/office/drawing/2015/10/21/chartex" xmlns:cx3="http://schemas.microsoft.com/office/drawing/2016/5/9/chartex" xmlns:cx4="http://schemas.microsoft.com/office/drawing/2016/5/10/chartex" xmlns:cx5="http://schemas.microsoft.com/office/drawing/2016/5/11/chartex" xmlns:cx6="http://schemas.microsoft.com/office/drawing/2016/5/12/chartex" xmlns:cx7="http://schemas.microsoft.com/office/drawing/2016/5/13/chartex" xmlns:cx8="http://schemas.microsoft.com/office/drawing/2016/5/14/chartex" xmlns:mc="http://schemas.openxmlformats.org/markup-compatibility/2006" xmlns:aink="http://schemas.microsoft.com/office/drawing/2016/ink" xmlns:am3d="http://schemas.microsoft.com/office/drawing/2017/model3d" xmlns:o="urn:schemas-microsoft-com:office:office" xmlns:oel="http://schemas.microsoft.com/office/2019/extlst" xmlns:r="http://schemas.openxmlformats.org/officeDocument/2006/relationships" xmlns:m="http://schemas.openxmlformats.org/officeDocument/2006/math" xmlns:v="urn:schemas-microsoft-com:vml" xmlns:wp14="http://schemas.microsoft.com/office/word/2010/wordprocessingDrawing" xmlns:wp="http://schemas.openxmlformats.org/drawingml/2006/wordprocessingDrawing" xmlns:w10="urn:schemas-microsoft-com:office:word" xmlns:w="http://schemas.openxmlformats.org/wordprocessingml/2006/main" xmlns:w14="http://schemas.microsoft.com/office/word/2010/wordml" xmlns:w15="http://schemas.microsoft.com/office/word/2012/wordml" xmlns:w16cex="http://schemas.microsoft.com/office/word/2018/wordml/cex" xmlns:w16cid="http://schemas.microsoft.com/office/word/2016/wordml/cid" xmlns:w16="http://schemas.microsoft.com/office/word/2018/wordml" xmlns:w16sdtdh="http://schemas.microsoft.com/office/word/2020/wordml/sdtdatahash" xmlns:w16se="http://schemas.microsoft.com/office/word/2015/wordml/symex" xmlns:wpg="http://schemas.microsoft.com/office/word/2010/wordprocessingGroup" xmlns:wpi="http://schemas.microsoft.com/office/word/2010/wordprocessingInk" xmlns:wne="http://schemas.microsoft.com/office/word/2006/wordml" xmlns:wps="http://schemas.microsoft.com/office/word/2010/wordprocessingShape" mc:Ignorable="w14 w15 w16se w16cid w16 w16cex w16sdtdh wp14">
+  <w:p>
+    <w:pPr>
+      <w:pStyle w:val="Footer"/>
+    </w:pPr>
+    <w:r>
+      <w:rPr>
+        <w:noProof/>
+      </w:rPr>
+      <mc:AlternateContent>
+        <mc:Choice Requires="wps">
+          <w:drawing>
+            <wp:anchor distT="0" distB="0" distL="114300" distR="114300" simplePos="0" relativeHeight="251659264" behindDoc="0" locked="0" layoutInCell="1" allowOverlap="1" wp14:anchorId="2F2F40D7" wp14:editId="2E11F537">
+              <wp:simplePos x="0" y="0"/>
+              <wp:positionH relativeFrom="margin">
+                <wp:align>left</wp:align>
+              </wp:positionH>
+              <wp:positionV relativeFrom="paragraph">
+                <wp:posOffset>-95250</wp:posOffset>
+              </wp:positionV>
+              <wp:extent cx="4328160" cy="266700"/>
+              <wp:effectExtent l="0" t="0" r="15240" b="19050"/>
+              <wp:wrapNone/>
+              <wp:docPr id="234541837" name="Rectangle 4"/>
+              <wp:cNvGraphicFramePr/>
+              <a:graphic xmlns:a="http://schemas.openxmlformats.org/drawingml/2006/main">
+                <a:graphicData uri="http://schemas.microsoft.com/office/word/2010/wordprocessingShape">
+                  <wps:wsp>
+                    <wps:cNvSpPr/>
+                    <wps:spPr>
+                      <a:xfrm>
+                        <a:off x="0" y="0"/>
+                        <a:ext cx="4328160" cy="266700"/>
+                      </a:xfrm>
+                      <a:prstGeom prst="rect">
+                        <a:avLst/>
+                      </a:prstGeom>
+                      <a:solidFill>
+                        <a:schemeClr val="bg1"/>
+                      </a:solidFill>
+                      <a:ln>
+                        <a:solidFill>
+                          <a:schemeClr val="bg1"/>
+                        </a:solidFill>
+                      </a:ln>
+                    </wps:spPr>
+                    <wps:style>
+                      <a:lnRef idx="2">
+                        <a:schemeClr val="accent1">
+                          <a:shade val="15000"/>
+                        </a:schemeClr>
+                      </a:lnRef>
+                      <a:fillRef idx="1">
+                        <a:schemeClr val="accent1"/>
+                      </a:fillRef>
+                      <a:effectRef idx="0">
+                        <a:schemeClr val="accent1"/>
+                      </a:effectRef>
+                      <a:fontRef idx="minor">
+                        <a:schemeClr val="lt1"/>
+                      </a:fontRef>
+                    </wps:style>
+                    <wps:txbx>
+                      <w:txbxContent>
+                        <w:p>
+                          <w:pPr>
+                            <w:rPr>
+                              <w:color w:val="000000" w:themeColor="text1"/>
+                              <w:sz w:val="20"/>
+                              <w:szCs w:val="20"/>
+                            </w:rPr>
+                          </w:pPr>
+                          <w:r>
+                            <w:rPr>
+                              <w:i/>
+                              <w:iCs/>
+                              <w:color w:val="000000" w:themeColor="text1"/>
+                              <w:sz w:val="20"/>
+                              <w:szCs w:val="20"/>
+                            </w:rPr>
+                            <w:t>Paraf Tim Verlap</w:t>
+                          </w:r>
+                          <w:r>
+                            <w:rPr>
+                              <w:color w:val="000000" w:themeColor="text1"/>
+                              <w:sz w:val="20"/>
+                              <w:szCs w:val="20"/>
+                            </w:rPr>
+                            <w:t>:..................................................................</w:t>
+                          </w:r>
+                        </w:p>
+                      </w:txbxContent>
+                    </wps:txbx>
+                    <wps:bodyPr rot="0" spcFirstLastPara="0" vertOverflow="overflow" horzOverflow="overflow" vert="horz" wrap="square" lIns="91440" tIns="45720" rIns="91440" bIns="45720" numCol="1" spcCol="0" rtlCol="0" fromWordArt="0" anchor="ctr" anchorCtr="0" forceAA="0" compatLnSpc="1">
+                      <a:prstTxWarp prst="textNoShape">
+                        <a:avLst/>
+                      </a:prstTxWarp>
+                      <a:noAutofit/>
+                    </wps:bodyPr>
+                  </wps:wsp>
+                </a:graphicData>
+              </a:graphic>
+              <wp14:sizeRelH relativeFrom="margin">
+                <wp14:pctWidth>0</wp14:pctWidth>
+              </wp14:sizeRelH>
+            </wp:anchor>
+          </w:drawing>
+        </mc:Choice>
+        <mc:Fallback>
+          <w:pict>
+            <v:rect w14:anchorId="2F2F40D7" id="Rectangle 4" o:spid="_x0000_s1026" style="position:absolute;margin-left:0;margin-top:-7.5pt;width:340.8pt;height:21pt;z-index:251659264;visibility:visible;mso-wrap-style:square;mso-width-percent:0;mso-wrap-distance-left:9pt;mso-wrap-distance-top:0;mso-wrap-distance-right:9pt;mso-wrap-distance-bottom:0;mso-position-horizontal:left;mso-position-horizontal-relative:margin;mso-position-vertical:absolute;mso-position-vertical-relative:text;mso-width-percent:0;mso-width-relative:margin;v-text-anchor:middle" o:gfxdata="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" fillcolor="white [3212]" strokecolor="white [3212]" strokeweight="2pt">
+              <v:textbox>
+                <w:txbxContent>
+                  <w:p>
+                    <w:pPr>
+                      <w:rPr>
+                        <w:color w:val="000000" w:themeColor="text1"/>
+                        <w:sz w:val="20"/>
+                        <w:szCs w:val="20"/>
+                      </w:rPr>
+                    </w:pPr>
+                    <w:r>
+                      <w:rPr>
+                        <w:i/>
+                        <w:iCs/>
+                        <w:color w:val="000000" w:themeColor="text1"/>
+                        <w:sz w:val="20"/>
+                        <w:szCs w:val="20"/>
+                      </w:rPr>
+                      <w:t>Paraf Tim Verlap</w:t>
+                    </w:r>
+                    <w:r>
+                      <w:rPr>
+                        <w:color w:val="000000" w:themeColor="text1"/>
+                        <w:sz w:val="20"/>
+                        <w:szCs w:val="20"/>
+                      </w:rPr>
+                      <w:t>:..................................................................</w:t>
+                    </w:r>
+                  </w:p>
+                </w:txbxContent>
+              </v:textbox>
+              <w10:wrap anchorx="margin"/>
+            </v:rect>
+          </w:pict>
+        </mc:Fallback>
+      </mc:AlternateContent>
+    </w:r>
+  </w:p>
+</w:ftr>
 </file>
 
 <file path=word/footnotes.xml><?xml version="1.0" encoding="utf-8"?>

</xml_diff>

<commit_message>
update: apply latest BA Verlap docx template fixes
</commit_message>
<xml_diff>
--- a/src/templates/verifikasi-lapangan/template_ba_verlap.docx
+++ b/src/templates/verifikasi-lapangan/template_ba_verlap.docx
@@ -476,38 +476,39 @@
       <w:r>
         <w:rPr>
           <w:rFonts w:ascii="Arial" w:eastAsia="Arial Unicode MS" w:hAnsi="Arial" w:cs="Arial"/>
-          <w:i/>
-          <w:iCs/>
           <w:lang w:eastAsia="id-ID"/>
         </w:rPr>
         <w:t>{</w:t>
       </w:r>
       <w:proofErr w:type="spellStart"/>
-      <w:r>
-        <w:rPr>
-          <w:rFonts w:ascii="Arial" w:eastAsia="Arial Unicode MS" w:hAnsi="Arial" w:cs="Arial"/>
-          <w:i/>
-          <w:iCs/>
-          <w:lang w:eastAsia="id-ID"/>
-        </w:rPr>
-        <w:t>hari_ini_nama</w:t>
-      </w:r>
-      <w:proofErr w:type="spellEnd"/>
-      <w:r>
-        <w:rPr>
-          <w:rFonts w:ascii="Arial" w:eastAsia="Arial Unicode MS" w:hAnsi="Arial" w:cs="Arial"/>
-          <w:i/>
-          <w:iCs/>
-          <w:lang w:eastAsia="id-ID"/>
-        </w:rPr>
-        <w:t>}</w:t>
-      </w:r>
       <w:r>
         <w:rPr>
           <w:rFonts w:ascii="Arial" w:eastAsia="Arial Unicode MS" w:hAnsi="Arial" w:cs="Arial"/>
           <w:lang w:eastAsia="id-ID"/>
         </w:rPr>
-        <w:t xml:space="preserve">, </w:t>
+        <w:t>hari_ini_nama</w:t>
+      </w:r>
+      <w:proofErr w:type="spellEnd"/>
+      <w:r>
+        <w:rPr>
+          <w:rFonts w:ascii="Arial" w:eastAsia="Arial Unicode MS" w:hAnsi="Arial" w:cs="Arial"/>
+          <w:lang w:eastAsia="id-ID"/>
+        </w:rPr>
+        <w:t>}</w:t>
+      </w:r>
+      <w:r>
+        <w:rPr>
+          <w:rFonts w:ascii="Arial" w:eastAsia="Arial Unicode MS" w:hAnsi="Arial" w:cs="Arial"/>
+          <w:lang w:eastAsia="id-ID"/>
+        </w:rPr>
+        <w:t>,</w:t>
+      </w:r>
+      <w:r>
+        <w:rPr>
+          <w:rFonts w:ascii="Arial" w:eastAsia="Arial Unicode MS" w:hAnsi="Arial" w:cs="Arial"/>
+          <w:lang w:eastAsia="id-ID"/>
+        </w:rPr>
+        <w:t xml:space="preserve"> </w:t>
       </w:r>
       <w:r>
         <w:rPr>

</xml_diff>